<commit_message>
docs(paper): tautan playlist rekaman simulasi di caption Figure 7
- main.tex: caption Fig. 7 menautkan playlist YouTube rekaman misi;
  versi anonim tidak memuat tautan (nama kanal membuka identitas penulis).
- EPIC2026_FullPaper_Izma_v1.docx: tautan yang sama (bisa diklik, format
  teks caption). PDF v1 hasil export Word belum diperbarui.
- main.pdf dan main_anon.pdf dibangun ulang (tetap 8 halaman).
</commit_message>
<xml_diff>
--- a/docs/Full Paper - EPIC/EPIC2026_FullPaper_Izma_v1.docx
+++ b/docs/Full Paper - EPIC/EPIC2026_FullPaper_Izma_v1.docx
@@ -10111,7 +10111,15 @@
         <w:t>∞</w:t>
       </w:r>
       <w:r>
-        <w:t xml:space="preserve"> missions, from the recordings.</w:t>
+        <w:t xml:space="preserve"> missions, from the recordings (</w:t>
+      </w:r>
+      <w:hyperlink r:id="rIdYtPlaylist" w:history="1">
+        <w:r>
+          <w:t>https://youtube.com/playlist?list=PLfxyCAwHmhHI</w:t>
+        </w:r>
+      </w:hyperlink>
+      <w:r>
+        <w:t>).</w:t>
       </w:r>
     </w:p>
     <w:p>

</xml_diff>

<commit_message>
docs(paper): tautan repositori GitHub di akhir abstrak
- main.tex: kalimat penutup abstrak menautkan kode sumber di GitHub; versi
  anonim menulis "[link removed for double-blind review]" karena username
  membuka identitas penulis.
- EPIC2026_FullPaper_Izma_v1.docx dan _Anonymous_v1.docx: kalimat yang sama.
  PDF v1 hasil export Word belum diperbarui.
- main.pdf dan main_anon.pdf dibangun ulang (tetap 8 halaman).
</commit_message>
<xml_diff>
--- a/docs/Full Paper - EPIC/EPIC2026_FullPaper_Izma_v1.docx
+++ b/docs/Full Paper - EPIC/EPIC2026_FullPaper_Izma_v1.docx
@@ -180,7 +180,15 @@
         <w:t>∞</w:t>
       </w:r>
       <w:r>
-        <w:t xml:space="preserve"> completed all four regions; in the three regions where both controllers finished, it lowered the RMS lateral sweep error by 16–31%, mostly by rejecting the mean wind, and finished 11–15% sooner, at 3.9–5.6 times the torque effort of PID-LQR. One PID-LQR mission was stopped after an agent struck an obstacle, and in three other missions an agent passed within rotor reach of a cylinder. Each configuration was flown once, so these are single-run observations.</w:t>
+        <w:t xml:space="preserve"> completed all four regions; in the three regions where both controllers finished, it lowered the RMS lateral sweep error by 16–31%, mostly by rejecting the mean wind, and finished 11–15% sooner, at 3.9–5.6 times the torque effort of PID-LQR. One PID-LQR mission was stopped after an agent struck an obstacle, and in three other missions an agent passed within rotor reach of a cylinder. Each configuration was flown once, so these are single-run observations. The source code is available at </w:t>
+      </w:r>
+      <w:hyperlink r:id="rIdGithubRepo" w:history="1">
+        <w:r>
+          <w:t>https://github.com/izmaherdian/swarm-quadrotor-mapping</w:t>
+        </w:r>
+      </w:hyperlink>
+      <w:r>
+        <w:t>.</w:t>
       </w:r>
     </w:p>
     <w:p>

</xml_diff>